<commit_message>
generación documentos en PDF, git ignore y readme
</commit_message>
<xml_diff>
--- a/Informe de resultados.docx
+++ b/Informe de resultados.docx
@@ -226,8 +226,14 @@
         <w:spacing w:after="0"/>
         <w:ind w:left="360" w:hanging="360"/>
         <w:jc w:val="both"/>
-      </w:pPr>
-      <w:r>
+        <w:rPr>
+          <w:lang w:val="en-US"/>
+        </w:rPr>
+      </w:pPr>
+      <w:r>
+        <w:rPr>
+          <w:lang w:val="en-US"/>
+        </w:rPr>
         <w:t>18092210-5</w:t>
       </w:r>
     </w:p>
@@ -236,8 +242,14 @@
         <w:spacing w:after="0"/>
         <w:ind w:left="360" w:hanging="360"/>
         <w:jc w:val="both"/>
-      </w:pPr>
-      <w:r>
+        <w:rPr>
+          <w:lang w:val="en-US"/>
+        </w:rPr>
+      </w:pPr>
+      <w:r>
+        <w:rPr>
+          <w:lang w:val="en-US"/>
+        </w:rPr>
         <w:t>QA Performance Engineer</w:t>
       </w:r>
     </w:p>
@@ -246,8 +258,14 @@
         <w:spacing w:after="0"/>
         <w:ind w:left="360" w:hanging="360"/>
         <w:jc w:val="both"/>
-      </w:pPr>
-      <w:r>
+        <w:rPr>
+          <w:lang w:val="en-US"/>
+        </w:rPr>
+      </w:pPr>
+      <w:r>
+        <w:rPr>
+          <w:lang w:val="en-US"/>
+        </w:rPr>
         <w:t>Versión 1.0</w:t>
       </w:r>
     </w:p>
@@ -256,23 +274,43 @@
         <w:spacing w:after="0"/>
         <w:ind w:left="360" w:hanging="360"/>
         <w:jc w:val="both"/>
-      </w:pPr>
-      <w:r>
+        <w:rPr>
+          <w:lang w:val="en-US"/>
+        </w:rPr>
+      </w:pPr>
+      <w:r>
+        <w:rPr>
+          <w:lang w:val="en-US"/>
+        </w:rPr>
         <w:t>23/05/2026</w:t>
       </w:r>
     </w:p>
     <w:p>
       <w:pPr>
         <w:jc w:val="both"/>
-      </w:pPr>
-      <w:r>
+        <w:rPr>
+          <w:lang w:val="en-US"/>
+        </w:rPr>
+      </w:pPr>
+      <w:r>
+        <w:rPr>
+          <w:lang w:val="en-US"/>
+        </w:rPr>
         <w:br w:type="page"/>
       </w:r>
     </w:p>
     <w:sdt>
       <w:sdtPr>
         <w:rPr>
+          <w:rFonts w:asciiTheme="minorHAnsi" w:eastAsiaTheme="minorHAnsi" w:hAnsiTheme="minorHAnsi" w:cstheme="minorBidi"/>
+          <w:b w:val="0"/>
+          <w:bCs w:val="0"/>
+          <w:color w:val="auto"/>
+          <w:kern w:val="2"/>
+          <w:sz w:val="24"/>
+          <w:szCs w:val="24"/>
           <w:lang w:val="es-ES"/>
+          <w14:ligatures w14:val="standardContextual"/>
         </w:rPr>
         <w:id w:val="-484091182"/>
         <w:docPartObj>
@@ -280,29 +318,13 @@
           <w:docPartUnique/>
         </w:docPartObj>
       </w:sdtPr>
-      <w:sdtEndPr>
-        <w:rPr>
-          <w:rFonts w:asciiTheme="minorHAnsi" w:eastAsiaTheme="minorHAnsi" w:hAnsiTheme="minorHAnsi" w:cstheme="minorBidi"/>
-          <w:color w:val="auto"/>
-          <w:kern w:val="2"/>
-          <w:sz w:val="24"/>
-          <w:szCs w:val="24"/>
-          <w14:ligatures w14:val="standardContextual"/>
-        </w:rPr>
-      </w:sdtEndPr>
       <w:sdtContent>
         <w:p>
           <w:pPr>
             <w:pStyle w:val="TOCHeading"/>
             <w:jc w:val="both"/>
-            <w:rPr>
-              <w:lang w:val="es-ES"/>
-            </w:rPr>
           </w:pPr>
           <w:r>
-            <w:rPr>
-              <w:lang w:val="es-ES"/>
-            </w:rPr>
             <w:t>Table of Contents</w:t>
           </w:r>
         </w:p>
@@ -2209,13 +2231,7 @@
       </w:r>
       <w:proofErr w:type="gramEnd"/>
       <w:r>
-        <w:t xml:space="preserve"> pruebas de performance y stress, realizados sobre la plataforma </w:t>
-      </w:r>
-      <w:r>
-        <w:t>E-commerce Performance Challenge</w:t>
-      </w:r>
-      <w:r>
-        <w:t>, del desafío para el rol QA Performance Engineer, en Walmart.</w:t>
+        <w:t xml:space="preserve"> pruebas de performance y stress, realizados sobre la plataforma E-commerce Performance Challenge, del desafío para el rol QA Performance Engineer, en Walmart.</w:t>
       </w:r>
     </w:p>
     <w:p>
@@ -2490,8 +2506,14 @@
           <w:p>
             <w:pPr>
               <w:jc w:val="both"/>
-            </w:pPr>
-            <w:r>
+              <w:rPr>
+                <w:lang w:val="en-US"/>
+              </w:rPr>
+            </w:pPr>
+            <w:r>
+              <w:rPr>
+                <w:lang w:val="en-US"/>
+              </w:rPr>
               <w:t>Next.js 15 + TypeScript backend (App Router).</w:t>
             </w:r>
           </w:p>
@@ -2884,13 +2906,7 @@
         <w:jc w:val="both"/>
       </w:pPr>
       <w:r>
-        <w:t xml:space="preserve">Las pruebas de performance están orientadas a validar el comportamiento del sistema bajo distintos niveles </w:t>
-      </w:r>
-      <w:r>
-        <w:t>d</w:t>
-      </w:r>
-      <w:r>
-        <w:t>e concurrencia mediante escenarios de carga concurrente, stress.</w:t>
+        <w:t>Las pruebas de performance están orientadas a validar el comportamiento del sistema bajo distintos niveles de concurrencia mediante escenarios de carga concurrente, stress.</w:t>
       </w:r>
     </w:p>
     <w:p>
@@ -3094,41 +3110,15 @@
           <w:numId w:val="6"/>
         </w:numPr>
         <w:jc w:val="both"/>
-      </w:pPr>
-      <w:r>
-        <w:t xml:space="preserve">Escenarios </w:t>
-      </w:r>
-      <w:proofErr w:type="spellStart"/>
-      <w:r>
-        <w:t>baseline</w:t>
-      </w:r>
-      <w:proofErr w:type="spellEnd"/>
-      <w:r>
-        <w:t xml:space="preserve">, </w:t>
-      </w:r>
-      <w:proofErr w:type="spellStart"/>
-      <w:r>
-        <w:t>smoke</w:t>
-      </w:r>
-      <w:proofErr w:type="spellEnd"/>
-      <w:r>
-        <w:t xml:space="preserve">, load, stress, </w:t>
-      </w:r>
-      <w:proofErr w:type="spellStart"/>
-      <w:r>
-        <w:t>spike</w:t>
-      </w:r>
-      <w:proofErr w:type="spellEnd"/>
-      <w:r>
-        <w:t xml:space="preserve"> y </w:t>
-      </w:r>
-      <w:proofErr w:type="spellStart"/>
-      <w:r>
-        <w:t>pagination</w:t>
-      </w:r>
-      <w:proofErr w:type="spellEnd"/>
-      <w:r>
-        <w:t>.</w:t>
+        <w:rPr>
+          <w:lang w:val="en-US"/>
+        </w:rPr>
+      </w:pPr>
+      <w:r>
+        <w:rPr>
+          <w:lang w:val="en-US"/>
+        </w:rPr>
+        <w:t>Escenarios baseline, smoke, load, stress, spike y pagination.</w:t>
       </w:r>
     </w:p>
     <w:p>
@@ -3563,10 +3553,7 @@
       </w:r>
       <w:proofErr w:type="spellEnd"/>
       <w:r>
-        <w:t xml:space="preserve"> fueron parametrizados dinámicamente</w:t>
-      </w:r>
-      <w:r>
-        <w:t>.</w:t>
+        <w:t xml:space="preserve"> fueron parametrizados dinámicamente.</w:t>
       </w:r>
     </w:p>
     <w:p>
@@ -3654,10 +3641,7 @@
               <w:jc w:val="both"/>
             </w:pPr>
             <w:r>
-              <w:t xml:space="preserve">1 </w:t>
-            </w:r>
-            <w:r>
-              <w:t xml:space="preserve">– </w:t>
+              <w:t xml:space="preserve">1 – </w:t>
             </w:r>
             <w:proofErr w:type="spellStart"/>
             <w:r>
@@ -4159,10 +4143,7 @@
         <w:jc w:val="both"/>
       </w:pPr>
       <w:r>
-        <w:t xml:space="preserve">GET </w:t>
-      </w:r>
-      <w:r>
-        <w:t>/api/</w:t>
+        <w:t>GET /api/</w:t>
       </w:r>
       <w:proofErr w:type="spellStart"/>
       <w:r>
@@ -4391,6 +4372,9 @@
         <w:jc w:val="both"/>
       </w:pPr>
       <w:r>
+        <w:rPr>
+          <w:noProof/>
+        </w:rPr>
         <w:drawing>
           <wp:inline distT="0" distB="0" distL="0" distR="0" wp14:anchorId="5CC3DE67" wp14:editId="493A7D5C">
             <wp:extent cx="5943600" cy="979170"/>
@@ -4456,13 +4440,7 @@
         <w:jc w:val="both"/>
       </w:pPr>
       <w:r>
-        <w:t>Se observ</w:t>
-      </w:r>
-      <w:r>
-        <w:t>a</w:t>
-      </w:r>
-      <w:r>
-        <w:t xml:space="preserve"> comportamiento estable bajo carga mínima.</w:t>
+        <w:t>Se observa comportamiento estable bajo carga mínima.</w:t>
       </w:r>
     </w:p>
     <w:p>
@@ -4528,28 +4506,7 @@
           <w:bCs/>
         </w:rPr>
         <w:lastRenderedPageBreak/>
-        <w:t xml:space="preserve">Escenario </w:t>
-      </w:r>
-      <w:r>
-        <w:rPr>
-          <w:b/>
-          <w:bCs/>
-        </w:rPr>
-        <w:t>2</w:t>
-      </w:r>
-      <w:r>
-        <w:rPr>
-          <w:b/>
-          <w:bCs/>
-        </w:rPr>
-        <w:t xml:space="preserve">: </w:t>
-      </w:r>
-      <w:r>
-        <w:rPr>
-          <w:b/>
-          <w:bCs/>
-        </w:rPr>
-        <w:t>Smoke Test</w:t>
+        <w:t>Escenario 2: Smoke Test</w:t>
       </w:r>
       <w:bookmarkEnd w:id="9"/>
     </w:p>
@@ -5067,6 +5024,9 @@
         <w:jc w:val="both"/>
       </w:pPr>
       <w:r>
+        <w:rPr>
+          <w:noProof/>
+        </w:rPr>
         <w:drawing>
           <wp:inline distT="0" distB="0" distL="0" distR="0" wp14:anchorId="2A70DFCF" wp14:editId="4DFAF2B8">
             <wp:extent cx="5943600" cy="955675"/>
@@ -5132,19 +5092,7 @@
         <w:jc w:val="both"/>
       </w:pPr>
       <w:r>
-        <w:t xml:space="preserve">La plataforma </w:t>
-      </w:r>
-      <w:r>
-        <w:t xml:space="preserve">se </w:t>
-      </w:r>
-      <w:r>
-        <w:t xml:space="preserve">mantuvo </w:t>
-      </w:r>
-      <w:r>
-        <w:t xml:space="preserve">estable </w:t>
-      </w:r>
-      <w:r>
-        <w:t>bajo carga baja.</w:t>
+        <w:t>La plataforma se mantuvo estable bajo carga baja.</w:t>
       </w:r>
     </w:p>
     <w:p>
@@ -5186,35 +5134,7 @@
           <w:bCs/>
         </w:rPr>
         <w:lastRenderedPageBreak/>
-        <w:t xml:space="preserve">Escenario </w:t>
-      </w:r>
-      <w:r>
-        <w:rPr>
-          <w:b/>
-          <w:bCs/>
-        </w:rPr>
-        <w:t>3</w:t>
-      </w:r>
-      <w:r>
-        <w:rPr>
-          <w:b/>
-          <w:bCs/>
-        </w:rPr>
-        <w:t xml:space="preserve">: </w:t>
-      </w:r>
-      <w:r>
-        <w:rPr>
-          <w:b/>
-          <w:bCs/>
-        </w:rPr>
-        <w:t>Load</w:t>
-      </w:r>
-      <w:r>
-        <w:rPr>
-          <w:b/>
-          <w:bCs/>
-        </w:rPr>
-        <w:t xml:space="preserve"> Test</w:t>
+        <w:t>Escenario 3: Load Test</w:t>
       </w:r>
       <w:bookmarkEnd w:id="10"/>
     </w:p>
@@ -5590,10 +5510,7 @@
               <w:jc w:val="both"/>
             </w:pPr>
             <w:r>
-              <w:t>718</w:t>
-            </w:r>
-            <w:r>
-              <w:t xml:space="preserve"> ms</w:t>
+              <w:t>718 ms</w:t>
             </w:r>
           </w:p>
         </w:tc>
@@ -5621,10 +5538,7 @@
               <w:jc w:val="both"/>
             </w:pPr>
             <w:r>
-              <w:t>1534</w:t>
-            </w:r>
-            <w:r>
-              <w:t xml:space="preserve"> ms</w:t>
+              <w:t>1534 ms</w:t>
             </w:r>
           </w:p>
         </w:tc>
@@ -5685,13 +5599,7 @@
               <w:jc w:val="both"/>
             </w:pPr>
             <w:r>
-              <w:t>0</w:t>
-            </w:r>
-            <w:r>
-              <w:t>,007</w:t>
-            </w:r>
-            <w:r>
-              <w:t>%</w:t>
+              <w:t>0,007%</w:t>
             </w:r>
           </w:p>
         </w:tc>
@@ -5719,10 +5627,7 @@
               <w:jc w:val="both"/>
             </w:pPr>
             <w:r>
-              <w:t>10</w:t>
-            </w:r>
-            <w:r>
-              <w:t xml:space="preserve"> minutos</w:t>
+              <w:t>10 minutos</w:t>
             </w:r>
           </w:p>
         </w:tc>
@@ -5750,10 +5655,7 @@
               <w:jc w:val="both"/>
             </w:pPr>
             <w:r>
-              <w:t>99</w:t>
-            </w:r>
-            <w:r>
-              <w:t>%</w:t>
+              <w:t>99%</w:t>
             </w:r>
           </w:p>
         </w:tc>
@@ -5769,6 +5671,9 @@
         <w:jc w:val="both"/>
       </w:pPr>
       <w:r>
+        <w:rPr>
+          <w:noProof/>
+        </w:rPr>
         <w:drawing>
           <wp:inline distT="0" distB="0" distL="0" distR="0" wp14:anchorId="38CC42A3" wp14:editId="43EAEE05">
             <wp:extent cx="5943600" cy="988695"/>
@@ -5829,6 +5734,9 @@
         <w:jc w:val="both"/>
       </w:pPr>
       <w:r>
+        <w:rPr>
+          <w:noProof/>
+        </w:rPr>
         <w:drawing>
           <wp:inline distT="0" distB="0" distL="0" distR="0" wp14:anchorId="07264671" wp14:editId="4A78F765">
             <wp:extent cx="5943600" cy="330835"/>
@@ -5890,6 +5798,9 @@
         <w:jc w:val="both"/>
       </w:pPr>
       <w:r>
+        <w:rPr>
+          <w:noProof/>
+        </w:rPr>
         <w:drawing>
           <wp:inline distT="0" distB="0" distL="0" distR="0" wp14:anchorId="003CEA40" wp14:editId="2A6500F6">
             <wp:extent cx="5943600" cy="2073275"/>
@@ -6030,35 +5941,7 @@
           <w:b/>
           <w:bCs/>
         </w:rPr>
-        <w:t xml:space="preserve">Escenario </w:t>
-      </w:r>
-      <w:r>
-        <w:rPr>
-          <w:b/>
-          <w:bCs/>
-        </w:rPr>
-        <w:t>4</w:t>
-      </w:r>
-      <w:r>
-        <w:rPr>
-          <w:b/>
-          <w:bCs/>
-        </w:rPr>
-        <w:t xml:space="preserve">: </w:t>
-      </w:r>
-      <w:r>
-        <w:rPr>
-          <w:b/>
-          <w:bCs/>
-        </w:rPr>
-        <w:t>Stress</w:t>
-      </w:r>
-      <w:r>
-        <w:rPr>
-          <w:b/>
-          <w:bCs/>
-        </w:rPr>
-        <w:t xml:space="preserve"> Test</w:t>
+        <w:t>Escenario 4: Stress Test</w:t>
       </w:r>
       <w:bookmarkEnd w:id="11"/>
     </w:p>
@@ -6550,6 +6433,9 @@
         <w:jc w:val="both"/>
       </w:pPr>
       <w:r>
+        <w:rPr>
+          <w:noProof/>
+        </w:rPr>
         <w:drawing>
           <wp:inline distT="0" distB="0" distL="0" distR="0" wp14:anchorId="0EF6F5F0" wp14:editId="777A561D">
             <wp:extent cx="5943600" cy="981075"/>
@@ -6610,6 +6496,9 @@
         <w:jc w:val="both"/>
       </w:pPr>
       <w:r>
+        <w:rPr>
+          <w:noProof/>
+        </w:rPr>
         <w:drawing>
           <wp:inline distT="0" distB="0" distL="0" distR="0" wp14:anchorId="09AE24A4" wp14:editId="4EC99A21">
             <wp:extent cx="5943600" cy="286385"/>
@@ -6670,6 +6559,9 @@
         <w:jc w:val="both"/>
       </w:pPr>
       <w:r>
+        <w:rPr>
+          <w:noProof/>
+        </w:rPr>
         <w:drawing>
           <wp:inline distT="0" distB="0" distL="0" distR="0" wp14:anchorId="131ACDCA" wp14:editId="2F734C29">
             <wp:extent cx="5943600" cy="2556510"/>
@@ -6738,35 +6630,7 @@
           <w:bCs/>
         </w:rPr>
         <w:lastRenderedPageBreak/>
-        <w:t xml:space="preserve">Escenario </w:t>
-      </w:r>
-      <w:r>
-        <w:rPr>
-          <w:b/>
-          <w:bCs/>
-        </w:rPr>
-        <w:t>5</w:t>
-      </w:r>
-      <w:r>
-        <w:rPr>
-          <w:b/>
-          <w:bCs/>
-        </w:rPr>
-        <w:t xml:space="preserve">: </w:t>
-      </w:r>
-      <w:r>
-        <w:rPr>
-          <w:b/>
-          <w:bCs/>
-        </w:rPr>
-        <w:t>Spike</w:t>
-      </w:r>
-      <w:r>
-        <w:rPr>
-          <w:b/>
-          <w:bCs/>
-        </w:rPr>
-        <w:t xml:space="preserve"> Test</w:t>
+        <w:t>Escenario 5: Spike Test</w:t>
       </w:r>
       <w:bookmarkEnd w:id="12"/>
     </w:p>
@@ -7277,6 +7141,9 @@
         <w:jc w:val="both"/>
       </w:pPr>
       <w:r>
+        <w:rPr>
+          <w:noProof/>
+        </w:rPr>
         <w:drawing>
           <wp:inline distT="0" distB="0" distL="0" distR="0" wp14:anchorId="57303B18" wp14:editId="2C4BF75C">
             <wp:extent cx="5943600" cy="981075"/>
@@ -7337,6 +7204,9 @@
         <w:jc w:val="both"/>
       </w:pPr>
       <w:r>
+        <w:rPr>
+          <w:noProof/>
+        </w:rPr>
         <w:drawing>
           <wp:inline distT="0" distB="0" distL="0" distR="0" wp14:anchorId="5A52FBC0" wp14:editId="09AED34A">
             <wp:extent cx="5943600" cy="411480"/>
@@ -7398,6 +7268,9 @@
         <w:jc w:val="both"/>
       </w:pPr>
       <w:r>
+        <w:rPr>
+          <w:noProof/>
+        </w:rPr>
         <w:drawing>
           <wp:inline distT="0" distB="0" distL="0" distR="0" wp14:anchorId="40B5A546" wp14:editId="21AA29E2">
             <wp:extent cx="5943600" cy="2614295"/>
@@ -7465,21 +7338,7 @@
           <w:b/>
           <w:bCs/>
         </w:rPr>
-        <w:t xml:space="preserve">Escenario </w:t>
-      </w:r>
-      <w:r>
-        <w:rPr>
-          <w:b/>
-          <w:bCs/>
-        </w:rPr>
-        <w:t>6</w:t>
-      </w:r>
-      <w:r>
-        <w:rPr>
-          <w:b/>
-          <w:bCs/>
-        </w:rPr>
-        <w:t xml:space="preserve">: </w:t>
+        <w:t xml:space="preserve">Escenario 6: </w:t>
       </w:r>
       <w:proofErr w:type="spellStart"/>
       <w:r>
@@ -8957,13 +8816,7 @@
         <w:jc w:val="both"/>
       </w:pPr>
       <w:r>
-        <w:t>La plataforma</w:t>
-      </w:r>
-      <w:r>
-        <w:t xml:space="preserve"> </w:t>
-      </w:r>
-      <w:r>
-        <w:t xml:space="preserve">E-commerce Performance Challenge presentó un comportamiento estable bajo escenarios </w:t>
+        <w:t xml:space="preserve">La plataforma E-commerce Performance Challenge presentó un comportamiento estable bajo escenarios </w:t>
       </w:r>
       <w:proofErr w:type="spellStart"/>
       <w:r>
@@ -8987,10 +8840,7 @@
         <w:jc w:val="both"/>
       </w:pPr>
       <w:r>
-        <w:t xml:space="preserve">Bajo escenarios de alta concurrencia y </w:t>
-      </w:r>
-      <w:r>
-        <w:t xml:space="preserve">aumento de tráfico simulando un </w:t>
+        <w:t xml:space="preserve">Bajo escenarios de alta concurrencia y aumento de tráfico simulando un </w:t>
       </w:r>
       <w:proofErr w:type="spellStart"/>
       <w:r>
@@ -8998,16 +8848,7 @@
       </w:r>
       <w:proofErr w:type="spellEnd"/>
       <w:r>
-        <w:t xml:space="preserve">, </w:t>
-      </w:r>
-      <w:r>
-        <w:t xml:space="preserve">se observó degradación progresiva principalmente sobre operaciones de checkout </w:t>
-      </w:r>
-      <w:r>
-        <w:t xml:space="preserve">(generación de orden) </w:t>
-      </w:r>
-      <w:r>
-        <w:t>y consulta de órdenes, comportamiento consistente con procesamiento CPU-bound descrito en el challenge.</w:t>
+        <w:t>, se observó degradación progresiva principalmente sobre operaciones de checkout (generación de orden) y consulta de órdenes, comportamiento consistente con procesamiento CPU-bound descrito en el challenge.</w:t>
       </w:r>
     </w:p>
     <w:p>

</xml_diff>